<commit_message>
Edit WorkLog week 8
</commit_message>
<xml_diff>
--- a/Work/2022182017_BGC/WorkLog/백경철_작업일지_8주차.docx
+++ b/Work/2022182017_BGC/WorkLog/백경철_작업일지_8주차.docx
@@ -210,9 +210,6 @@
               <w:tabs>
                 <w:tab w:val="left" w:pos="2765"/>
               </w:tabs>
-              <w:rPr>
-                <w:rFonts w:hint="eastAsia"/>
-              </w:rPr>
             </w:pPr>
             <w:r>
               <w:t xml:space="preserve">1. </w:t>
@@ -459,6 +456,9 @@
         </w:tabs>
       </w:pPr>
       <w:r>
+        <w:rPr>
+          <w:noProof/>
+        </w:rPr>
         <w:lastRenderedPageBreak/>
         <w:drawing>
           <wp:inline distT="0" distB="0" distL="0" distR="0" wp14:anchorId="1BBFB45A" wp14:editId="525C9690">
@@ -504,6 +504,9 @@
         </w:tabs>
       </w:pPr>
       <w:r>
+        <w:rPr>
+          <w:noProof/>
+        </w:rPr>
         <w:drawing>
           <wp:inline distT="0" distB="0" distL="0" distR="0" wp14:anchorId="06002F1E" wp14:editId="0831CCBA">
             <wp:extent cx="5731510" cy="3470910"/>
@@ -553,9 +556,6 @@
         <w:tabs>
           <w:tab w:val="left" w:pos="2765"/>
         </w:tabs>
-        <w:rPr>
-          <w:rFonts w:hint="eastAsia"/>
-        </w:rPr>
       </w:pPr>
     </w:p>
     <w:tbl>
@@ -834,16 +834,24 @@
               <w:rPr>
                 <w:rFonts w:hint="eastAsia"/>
               </w:rPr>
-              <w:t>추가적인 상호작용 오브젝트 구현</w:t>
+              <w:t xml:space="preserve">마네킹 </w:t>
+            </w:r>
+            <w:proofErr w:type="gramStart"/>
+            <w:r>
+              <w:t xml:space="preserve">AI </w:t>
             </w:r>
             <w:r>
               <w:rPr>
                 <w:rFonts w:hint="eastAsia"/>
               </w:rPr>
-              <w:t>(수정될 수 있음.</w:t>
-            </w:r>
-            <w:r>
-              <w:t>)</w:t>
+              <w:t>의</w:t>
+            </w:r>
+            <w:proofErr w:type="gramEnd"/>
+            <w:r>
+              <w:rPr>
+                <w:rFonts w:hint="eastAsia"/>
+              </w:rPr>
+              <w:t xml:space="preserve"> 연구를 위해 다른 알고리즘을 구현하기</w:t>
             </w:r>
           </w:p>
         </w:tc>

</xml_diff>